<commit_message>
Update CRM Dashboard specifications in Word documents (v1.1)
Co-authored-by: SokKimThanh <20368186+SokKimThanh@users.noreply.github.com>
</commit_message>
<xml_diff>
--- a/TRANG 2 Lịch sử phiên bản.docx
+++ b/TRANG 2 Lịch sử phiên bản.docx
@@ -576,13 +576,9 @@
             <w:tcW w:w="1435" w:type="dxa"/>
           </w:tcPr>
           <w:p>
-            <w:pPr>
-              <w:jc w:val="center"/>
-              <w:rPr>
-                <w:sz w:val="22"/>
-                <w:szCs w:val="22"/>
-              </w:rPr>
-            </w:pPr>
+            <w:r>
+              <w:t>1.1</w:t>
+            </w:r>
           </w:p>
         </w:tc>
         <w:tc>
@@ -590,13 +586,9 @@
             <w:tcW w:w="1260" w:type="dxa"/>
           </w:tcPr>
           <w:p>
-            <w:pPr>
-              <w:jc w:val="center"/>
-              <w:rPr>
-                <w:sz w:val="22"/>
-                <w:szCs w:val="22"/>
-              </w:rPr>
-            </w:pPr>
+            <w:r>
+              <w:t>26/9/2026</w:t>
+            </w:r>
           </w:p>
         </w:tc>
         <w:tc>
@@ -604,12 +596,9 @@
             <w:tcW w:w="1980" w:type="dxa"/>
           </w:tcPr>
           <w:p>
-            <w:pPr>
-              <w:rPr>
-                <w:sz w:val="22"/>
-                <w:szCs w:val="22"/>
-              </w:rPr>
-            </w:pPr>
+            <w:r>
+              <w:t>SOK KIM THANH</w:t>
+            </w:r>
           </w:p>
         </w:tc>
         <w:tc>
@@ -617,12 +606,9 @@
             <w:tcW w:w="2610" w:type="dxa"/>
           </w:tcPr>
           <w:p>
-            <w:pPr>
-              <w:rPr>
-                <w:sz w:val="22"/>
-                <w:szCs w:val="22"/>
-              </w:rPr>
-            </w:pPr>
+            <w:r>
+              <w:t>Cập nhật mô tả Dashboard thiết kế mới (thanh Notify, KPI Cơ hội thành công, Kế hoạch hành động, Kho riêng biệt, Biểu đồ phễu, Chú thích doanh thu)</w:t>
+            </w:r>
           </w:p>
         </w:tc>
         <w:tc>
@@ -630,12 +616,9 @@
             <w:tcW w:w="1731" w:type="dxa"/>
           </w:tcPr>
           <w:p>
-            <w:pPr>
-              <w:rPr>
-                <w:sz w:val="22"/>
-                <w:szCs w:val="22"/>
-              </w:rPr>
-            </w:pPr>
+            <w:r>
+              <w:t>Dự thảo</w:t>
+            </w:r>
           </w:p>
         </w:tc>
       </w:tr>

</xml_diff>